<commit_message>
docs: refine master ats resume from checker feedback
</commit_message>
<xml_diff>
--- a/resumes/Mohammed_Nafees_H_Master_ATS.docx
+++ b/resumes/Mohammed_Nafees_H_Master_ATS.docx
@@ -4,601 +4,557 @@
   <w:body>
     <w:p>
       <w:pPr>
-        <w:spacing w:after="20"/>
         <w:jc w:val="center"/>
       </w:pPr>
       <w:r>
         <w:rPr>
-          <w:rFonts w:ascii="Arial" w:hAnsi="Arial" w:eastAsia="Arial"/>
+          <w:rFonts w:ascii="Arial" w:hAnsi="Arial"/>
           <w:b/>
-          <w:color w:val="12385F"/>
-          <w:sz w:val="32"/>
+          <w:sz w:val="30"/>
         </w:rPr>
         <w:t>MOHAMMED NAFEES H</w:t>
       </w:r>
     </w:p>
     <w:p>
       <w:pPr>
-        <w:spacing w:after="0"/>
         <w:jc w:val="center"/>
       </w:pPr>
       <w:r>
         <w:rPr>
-          <w:rFonts w:ascii="Arial" w:hAnsi="Arial" w:eastAsia="Arial"/>
-          <w:b/>
-          <w:sz w:val="18"/>
+          <w:rFonts w:ascii="Arial" w:hAnsi="Arial"/>
+          <w:sz w:val="15"/>
         </w:rPr>
         <w:t>Robotics Engineering / Robotics Software / Embedded Robotics Intern</w:t>
       </w:r>
     </w:p>
     <w:p>
       <w:pPr>
-        <w:spacing w:after="0"/>
         <w:jc w:val="center"/>
       </w:pPr>
       <w:r>
         <w:rPr>
-          <w:rFonts w:ascii="Arial" w:hAnsi="Arial" w:eastAsia="Arial"/>
-          <w:i/>
-          <w:color w:val="1F5FA8"/>
-          <w:sz w:val="16"/>
+          <w:rFonts w:ascii="Arial" w:hAnsi="Arial"/>
+          <w:sz w:val="15"/>
         </w:rPr>
-        <w:t>Phone: 9629461267 | Email: mohammednafees1007@gmail.com | Location: Kumbakonam, Tamil Nadu, India</w:t>
+        <w:t>Phone: +91 962-946-1267 | Email: mohammednafees1007@gmail.com | Location: Kumbakonam, Tamil Nadu, India</w:t>
       </w:r>
     </w:p>
     <w:p>
       <w:pPr>
-        <w:spacing w:after="0"/>
         <w:jc w:val="center"/>
       </w:pPr>
       <w:r>
         <w:rPr>
-          <w:rFonts w:ascii="Arial" w:hAnsi="Arial" w:eastAsia="Arial"/>
-          <w:i/>
-          <w:color w:val="1F5FA8"/>
-          <w:sz w:val="16"/>
+          <w:rFonts w:ascii="Arial" w:hAnsi="Arial"/>
+          <w:sz w:val="15"/>
         </w:rPr>
         <w:t>LinkedIn: https://www.linkedin.com/in/mohammed-nafees-h-7b3377306</w:t>
       </w:r>
     </w:p>
     <w:p>
       <w:pPr>
-        <w:spacing w:after="0"/>
         <w:jc w:val="center"/>
       </w:pPr>
       <w:r>
         <w:rPr>
-          <w:rFonts w:ascii="Arial" w:hAnsi="Arial" w:eastAsia="Arial"/>
-          <w:i/>
-          <w:color w:val="1F5FA8"/>
-          <w:sz w:val="16"/>
+          <w:rFonts w:ascii="Arial" w:hAnsi="Arial"/>
+          <w:sz w:val="15"/>
         </w:rPr>
         <w:t>GitHub: https://github.com/mohammednafees1007-hub</w:t>
       </w:r>
     </w:p>
     <w:p>
       <w:pPr>
-        <w:spacing w:before="60" w:after="0"/>
+        <w:spacing w:before="44" w:after="16"/>
         <w:pBdr>
-          <w:bottom w:val="single" w:sz="4" w:space="1" w:color="666666"/>
+          <w:bottom w:val="single" w:sz="4" w:space="1" w:color="000000"/>
         </w:pBdr>
       </w:pPr>
       <w:r>
         <w:rPr>
-          <w:rFonts w:ascii="Arial" w:hAnsi="Arial" w:eastAsia="Arial"/>
+          <w:rFonts w:ascii="Arial" w:hAnsi="Arial"/>
           <w:b/>
-          <w:sz w:val="19"/>
+          <w:sz w:val="16"/>
         </w:rPr>
         <w:t>PROFESSIONAL SUMMARY</w:t>
       </w:r>
     </w:p>
     <w:p>
-      <w:pPr>
-        <w:spacing w:after="0"/>
-      </w:pPr>
       <w:r>
         <w:rPr>
-          <w:rFonts w:ascii="Arial" w:hAnsi="Arial" w:eastAsia="Arial"/>
-          <w:sz w:val="17"/>
+          <w:rFonts w:ascii="Arial" w:hAnsi="Arial"/>
+          <w:sz w:val="15"/>
         </w:rPr>
-        <w:t>B.Tech Robotics &amp; Artificial Intelligence student at SASTRA University, Class of 2028, targeting robotics engineering, robotics software, and embedded robotics internships. Hands-on experience across ROS 2 workflows, Python/C++ robotics programming, embedded hardware, sensors, motor control, computer vision, and AI backend pipelines. Built a 4x4 Arduino-Python autonomous navigation robot, a 3-class fruit quality grading system, and a 3-stage YOLO/OpenCV/BLIP image-analysis backend for a larger Visage project.</w:t>
+        <w:t>B.Tech Robotics &amp; Artificial Intelligence student at SASTRA University, Class of 2028, targeting robotics engineering, robotics software, and embedded robotics internships. Hands-on experience across ROS 2 workflows, Python/C++ robotics programming, embedded hardware, sensors, motor control, computer vision, and AI backend pipelines. Engineered a 4x4 Arduino-Python autonomous navigation robot, a 3-class fruit quality grading system, and a 3-stage YOLO/OpenCV/BLIP image-analysis backend for a larger Visage project.</w:t>
       </w:r>
     </w:p>
     <w:p>
       <w:pPr>
-        <w:spacing w:before="60" w:after="0"/>
+        <w:spacing w:before="44" w:after="16"/>
         <w:pBdr>
-          <w:bottom w:val="single" w:sz="4" w:space="1" w:color="666666"/>
+          <w:bottom w:val="single" w:sz="4" w:space="1" w:color="000000"/>
         </w:pBdr>
       </w:pPr>
       <w:r>
         <w:rPr>
-          <w:rFonts w:ascii="Arial" w:hAnsi="Arial" w:eastAsia="Arial"/>
+          <w:rFonts w:ascii="Arial" w:hAnsi="Arial"/>
           <w:b/>
-          <w:sz w:val="19"/>
+          <w:sz w:val="16"/>
         </w:rPr>
         <w:t>EDUCATION</w:t>
       </w:r>
     </w:p>
     <w:p>
-      <w:pPr>
-        <w:spacing w:after="0"/>
-      </w:pPr>
       <w:r>
         <w:rPr>
-          <w:rFonts w:ascii="Arial" w:hAnsi="Arial" w:eastAsia="Arial"/>
+          <w:rFonts w:ascii="Arial" w:hAnsi="Arial"/>
           <w:b/>
-          <w:sz w:val="17"/>
+          <w:sz w:val="15"/>
         </w:rPr>
         <w:t>SASTRA Deemed University | B.Tech, Robotics &amp; Artificial Intelligence | Aug 2024 - May 2028 | Tamil Nadu, India</w:t>
       </w:r>
     </w:p>
     <w:p>
       <w:pPr>
-        <w:spacing w:before="60" w:after="0"/>
+        <w:spacing w:before="44" w:after="16"/>
         <w:pBdr>
-          <w:bottom w:val="single" w:sz="4" w:space="1" w:color="666666"/>
+          <w:bottom w:val="single" w:sz="4" w:space="1" w:color="000000"/>
         </w:pBdr>
       </w:pPr>
       <w:r>
         <w:rPr>
-          <w:rFonts w:ascii="Arial" w:hAnsi="Arial" w:eastAsia="Arial"/>
+          <w:rFonts w:ascii="Arial" w:hAnsi="Arial"/>
           <w:b/>
-          <w:sz w:val="19"/>
+          <w:sz w:val="16"/>
         </w:rPr>
         <w:t>TECHNICAL SKILLS</w:t>
       </w:r>
     </w:p>
     <w:p>
       <w:pPr>
-        <w:spacing w:after="0"/>
-        <w:ind w:left="0" w:firstLine="0"/>
+        <w:pStyle w:val="ListBullet"/>
+        <w:spacing w:after="10"/>
+        <w:ind w:left="187" w:hanging="187"/>
       </w:pPr>
       <w:r>
         <w:rPr>
-          <w:rFonts w:ascii="Arial" w:hAnsi="Arial" w:eastAsia="Arial"/>
-          <w:sz w:val="16"/>
+          <w:rFonts w:ascii="Arial" w:hAnsi="Arial"/>
+          <w:sz w:val="14"/>
         </w:rPr>
-        <w:t>- Robotics Software: ROS 2, Python, C/C++, Linux/Ubuntu, Git, robot integration, A* path planning, controls basics, sensor debugging</w:t>
+        <w:t>Robotics Software: ROS 2, Python, C/C++, Linux/Ubuntu, Git, robot integration, A* path planning, controls basics, sensor debugging</w:t>
       </w:r>
     </w:p>
     <w:p>
       <w:pPr>
-        <w:spacing w:after="0"/>
-        <w:ind w:left="0" w:firstLine="0"/>
+        <w:pStyle w:val="ListBullet"/>
+        <w:spacing w:after="10"/>
+        <w:ind w:left="187" w:hanging="187"/>
       </w:pPr>
       <w:r>
         <w:rPr>
-          <w:rFonts w:ascii="Arial" w:hAnsi="Arial" w:eastAsia="Arial"/>
-          <w:sz w:val="16"/>
+          <w:rFonts w:ascii="Arial" w:hAnsi="Arial"/>
+          <w:sz w:val="14"/>
         </w:rPr>
-        <w:t>- Embedded Hardware: Arduino, ESP32, STM32, Raspberry Pi 5, Raspberry Pi Zero 2 W, Pi Camera, GPIO, motor drivers, encoders, IR sensors</w:t>
+        <w:t>Embedded Hardware: Arduino, ESP32, STM32, Raspberry Pi 5, Raspberry Pi Zero 2 W, Pi Camera, GPIO, motor drivers, encoders, IR sensors</w:t>
       </w:r>
     </w:p>
     <w:p>
       <w:pPr>
-        <w:spacing w:after="0"/>
-        <w:ind w:left="0" w:firstLine="0"/>
+        <w:pStyle w:val="ListBullet"/>
+        <w:spacing w:after="10"/>
+        <w:ind w:left="187" w:hanging="187"/>
       </w:pPr>
       <w:r>
         <w:rPr>
-          <w:rFonts w:ascii="Arial" w:hAnsi="Arial" w:eastAsia="Arial"/>
-          <w:sz w:val="16"/>
+          <w:rFonts w:ascii="Arial" w:hAnsi="Arial"/>
+          <w:sz w:val="14"/>
         </w:rPr>
-        <w:t>- Communication &amp; Sensors: I2C, UART, LiDAR, IMU, camera sensors, serial communication, sensor/actuator interfacing</w:t>
+        <w:t>Communication &amp; Sensors: I2C, UART, LiDAR, IMU, camera sensors, serial communication, sensor/actuator interfacing</w:t>
       </w:r>
     </w:p>
     <w:p>
       <w:pPr>
-        <w:spacing w:after="0"/>
-        <w:ind w:left="0" w:firstLine="0"/>
+        <w:pStyle w:val="ListBullet"/>
+        <w:spacing w:after="10"/>
+        <w:ind w:left="187" w:hanging="187"/>
       </w:pPr>
       <w:r>
         <w:rPr>
-          <w:rFonts w:ascii="Arial" w:hAnsi="Arial" w:eastAsia="Arial"/>
-          <w:sz w:val="16"/>
+          <w:rFonts w:ascii="Arial" w:hAnsi="Arial"/>
+          <w:sz w:val="14"/>
         </w:rPr>
-        <w:t>- Hardware Lab Exposure: soldering, schematic reading, hardware bring-up, wiring, component evaluation, procurement coordination</w:t>
+        <w:t>Hardware Lab Exposure: soldering, schematic reading, hardware bring-up, wiring, component evaluation, procurement coordination</w:t>
       </w:r>
     </w:p>
     <w:p>
       <w:pPr>
-        <w:spacing w:after="0"/>
-        <w:ind w:left="0" w:firstLine="0"/>
+        <w:pStyle w:val="ListBullet"/>
+        <w:spacing w:after="10"/>
+        <w:ind w:left="187" w:hanging="187"/>
       </w:pPr>
       <w:r>
         <w:rPr>
-          <w:rFonts w:ascii="Arial" w:hAnsi="Arial" w:eastAsia="Arial"/>
-          <w:sz w:val="16"/>
+          <w:rFonts w:ascii="Arial" w:hAnsi="Arial"/>
+          <w:sz w:val="14"/>
         </w:rPr>
-        <w:t>- AI &amp; Computer Vision: OpenCV, YOLOv8, Ultralytics, TensorFlow/Keras, CLIP, BLIP, Hugging Face Transformers, image classification, object detection, scene captioning</w:t>
+        <w:t>AI &amp; Computer Vision: OpenCV, YOLOv8, Ultralytics, TensorFlow/Keras, CLIP, BLIP, Hugging Face Transformers, image classification, object detection, scene captioning</w:t>
       </w:r>
     </w:p>
     <w:p>
       <w:pPr>
-        <w:spacing w:after="0"/>
-        <w:ind w:left="0" w:firstLine="0"/>
+        <w:pStyle w:val="ListBullet"/>
+        <w:spacing w:after="10"/>
+        <w:ind w:left="187" w:hanging="187"/>
       </w:pPr>
       <w:r>
         <w:rPr>
-          <w:rFonts w:ascii="Arial" w:hAnsi="Arial" w:eastAsia="Arial"/>
-          <w:sz w:val="16"/>
+          <w:rFonts w:ascii="Arial" w:hAnsi="Arial"/>
+          <w:sz w:val="14"/>
         </w:rPr>
-        <w:t>- Tools: VS Code, Ubuntu 24.04, CoppeliaSim, Fusion 360, EasyEDA/KiCad basics</w:t>
+        <w:t>Tools: VS Code, Ubuntu 24.04, CoppeliaSim, Fusion 360, EasyEDA/KiCad basics</w:t>
       </w:r>
     </w:p>
     <w:p>
       <w:pPr>
-        <w:spacing w:before="60" w:after="0"/>
+        <w:spacing w:before="44" w:after="16"/>
         <w:pBdr>
-          <w:bottom w:val="single" w:sz="4" w:space="1" w:color="666666"/>
+          <w:bottom w:val="single" w:sz="4" w:space="1" w:color="000000"/>
         </w:pBdr>
       </w:pPr>
       <w:r>
         <w:rPr>
-          <w:rFonts w:ascii="Arial" w:hAnsi="Arial" w:eastAsia="Arial"/>
+          <w:rFonts w:ascii="Arial" w:hAnsi="Arial"/>
           <w:b/>
-          <w:sz w:val="19"/>
+          <w:sz w:val="16"/>
         </w:rPr>
         <w:t>EXPERIENCE</w:t>
       </w:r>
     </w:p>
     <w:p>
-      <w:pPr>
-        <w:spacing w:after="0"/>
-      </w:pPr>
       <w:r>
         <w:rPr>
-          <w:rFonts w:ascii="Arial" w:hAnsi="Arial" w:eastAsia="Arial"/>
+          <w:rFonts w:ascii="Arial" w:hAnsi="Arial"/>
           <w:b/>
-          <w:sz w:val="17"/>
+          <w:sz w:val="15"/>
         </w:rPr>
-        <w:t>Confidential Industrial Robotics Project | Robotics Engineering Contributor | ROS 2, Controls, Embedded Integration</w:t>
+        <w:t>Industrial Robotics Engineering Project | Robotics Engineering Contributor | ROS 2, Controls, Embedded Integration</w:t>
       </w:r>
     </w:p>
     <w:p>
       <w:pPr>
-        <w:spacing w:after="0"/>
+        <w:pStyle w:val="ListBullet"/>
+        <w:spacing w:after="10"/>
+        <w:ind w:left="187" w:hanging="187"/>
       </w:pPr>
       <w:r>
         <w:rPr>
-          <w:rFonts w:ascii="Arial" w:hAnsi="Arial" w:eastAsia="Arial"/>
-          <w:i/>
-          <w:sz w:val="17"/>
+          <w:rFonts w:ascii="Arial" w:hAnsi="Arial"/>
+          <w:sz w:val="14"/>
         </w:rPr>
-        <w:t>Project details withheld due to signed confidentiality / NDA obligations.</w:t>
+        <w:t>Contribute to ROS 2 based robotics workflows, controls-oriented development, embedded integration, sensor/actuator evaluation, and hardware coordination under professional constraints.</w:t>
       </w:r>
     </w:p>
     <w:p>
       <w:pPr>
-        <w:spacing w:after="0"/>
-        <w:ind w:left="0" w:firstLine="0"/>
+        <w:pStyle w:val="ListBullet"/>
+        <w:spacing w:after="10"/>
+        <w:ind w:left="187" w:hanging="187"/>
       </w:pPr>
       <w:r>
         <w:rPr>
-          <w:rFonts w:ascii="Arial" w:hAnsi="Arial" w:eastAsia="Arial"/>
-          <w:sz w:val="16"/>
+          <w:rFonts w:ascii="Arial" w:hAnsi="Arial"/>
+          <w:sz w:val="14"/>
         </w:rPr>
-        <w:t>- Support ROS 2 based robotics workflows, controls-oriented development, embedded integration, sensor/actuator evaluation, and hardware coordination under professional confidentiality constraints.</w:t>
+        <w:t>Coordinate component identification, evaluation, and procurement support for a project hardware budget of approximately Rs. 10 lakh.</w:t>
       </w:r>
     </w:p>
     <w:p>
       <w:pPr>
-        <w:spacing w:after="0"/>
-        <w:ind w:left="0" w:firstLine="0"/>
+        <w:pStyle w:val="ListBullet"/>
+        <w:spacing w:after="10"/>
+        <w:ind w:left="187" w:hanging="187"/>
       </w:pPr>
       <w:r>
         <w:rPr>
-          <w:rFonts w:ascii="Arial" w:hAnsi="Arial" w:eastAsia="Arial"/>
-          <w:sz w:val="16"/>
+          <w:rFonts w:ascii="Arial" w:hAnsi="Arial"/>
+          <w:sz w:val="14"/>
         </w:rPr>
-        <w:t>- Coordinate component identification, evaluation, and procurement support for a project hardware budget of approximately Rs. 10 lakh.</w:t>
+        <w:t>Work across robotics software, electronics, and mechanical constraints for deployment-oriented industrial robotics tasks.</w:t>
       </w:r>
     </w:p>
     <w:p>
       <w:pPr>
-        <w:spacing w:after="0"/>
-        <w:ind w:left="0" w:firstLine="0"/>
-      </w:pPr>
-      <w:r>
-        <w:rPr>
-          <w:rFonts w:ascii="Arial" w:hAnsi="Arial" w:eastAsia="Arial"/>
-          <w:sz w:val="16"/>
-        </w:rPr>
-        <w:t>- Work across robotics software, electronics, and mechanical constraints for deployment-oriented industrial robotics tasks.</w:t>
-      </w:r>
-    </w:p>
-    <w:p>
-      <w:pPr>
-        <w:spacing w:before="60" w:after="0"/>
+        <w:spacing w:before="44" w:after="16"/>
         <w:pBdr>
-          <w:bottom w:val="single" w:sz="4" w:space="1" w:color="666666"/>
+          <w:bottom w:val="single" w:sz="4" w:space="1" w:color="000000"/>
         </w:pBdr>
       </w:pPr>
       <w:r>
         <w:rPr>
-          <w:rFonts w:ascii="Arial" w:hAnsi="Arial" w:eastAsia="Arial"/>
+          <w:rFonts w:ascii="Arial" w:hAnsi="Arial"/>
           <w:b/>
-          <w:sz w:val="19"/>
+          <w:sz w:val="16"/>
         </w:rPr>
         <w:t>PROJECTS</w:t>
       </w:r>
     </w:p>
     <w:p>
-      <w:pPr>
-        <w:spacing w:after="0"/>
-      </w:pPr>
       <w:r>
         <w:rPr>
-          <w:rFonts w:ascii="Arial" w:hAnsi="Arial" w:eastAsia="Arial"/>
+          <w:rFonts w:ascii="Arial" w:hAnsi="Arial"/>
           <w:b/>
-          <w:sz w:val="17"/>
+          <w:sz w:val="15"/>
         </w:rPr>
-        <w:t>Hadi Al Hajatron | Arduino, Python, Tkinter, IR Sensors, Encoders, A* Path Planning</w:t>
+        <w:t>Hadi Al Hajatron | Arduino, Python, IR Sensors, Encoders, A* Path Planning</w:t>
       </w:r>
     </w:p>
     <w:p>
       <w:pPr>
-        <w:spacing w:after="0"/>
         <w:jc w:val="center"/>
       </w:pPr>
       <w:r>
         <w:rPr>
-          <w:rFonts w:ascii="Arial" w:hAnsi="Arial" w:eastAsia="Arial"/>
-          <w:i/>
-          <w:color w:val="1F5FA8"/>
-          <w:sz w:val="16"/>
+          <w:rFonts w:ascii="Arial" w:hAnsi="Arial"/>
+          <w:sz w:val="15"/>
         </w:rPr>
         <w:t>GitHub: https://github.com/mohammednafees1007-hub/Hadi-Al-Hajatron</w:t>
       </w:r>
     </w:p>
     <w:p>
       <w:pPr>
-        <w:spacing w:after="0"/>
-        <w:ind w:left="0" w:firstLine="0"/>
+        <w:pStyle w:val="ListBullet"/>
+        <w:spacing w:after="10"/>
+        <w:ind w:left="187" w:hanging="187"/>
       </w:pPr>
       <w:r>
         <w:rPr>
-          <w:rFonts w:ascii="Arial" w:hAnsi="Arial" w:eastAsia="Arial"/>
-          <w:sz w:val="16"/>
+          <w:rFonts w:ascii="Arial" w:hAnsi="Arial"/>
+          <w:sz w:val="14"/>
         </w:rPr>
-        <w:t>- Built a 4x4 Arduino-Python autonomous grid-navigation robot with 3 IR obstacle sensors, 60 cm calibrated movement steps, live Tkinter mapping, JSON map export, and A* route planning.</w:t>
+        <w:t>Engineered a 4x4 Arduino-Python autonomous grid-navigation robot with 3 IR obstacle sensors, 60 cm calibrated movement steps, live mapping, map export, and A* route planning.</w:t>
+      </w:r>
+    </w:p>
+    <w:p>
+      <w:r>
+        <w:rPr>
+          <w:rFonts w:ascii="Arial" w:hAnsi="Arial"/>
+          <w:b/>
+          <w:sz w:val="15"/>
+        </w:rPr>
+        <w:t>FruitVision AI - Fruit Quality Detector for SMS | YOLOv8x, Keras, CLIP, OpenCV</w:t>
       </w:r>
     </w:p>
     <w:p>
       <w:pPr>
-        <w:spacing w:after="0"/>
-      </w:pPr>
-      <w:r>
-        <w:rPr>
-          <w:rFonts w:ascii="Arial" w:hAnsi="Arial" w:eastAsia="Arial"/>
-          <w:b/>
-          <w:sz w:val="17"/>
-        </w:rPr>
-        <w:t>FruitVision AI - Fruit Quality Detector for SMS | FastAPI, YOLOv8x, Keras, CLIP, Next.js</w:t>
-      </w:r>
-    </w:p>
-    <w:p>
-      <w:pPr>
-        <w:spacing w:after="0"/>
         <w:jc w:val="center"/>
       </w:pPr>
       <w:r>
         <w:rPr>
-          <w:rFonts w:ascii="Arial" w:hAnsi="Arial" w:eastAsia="Arial"/>
-          <w:i/>
-          <w:color w:val="1F5FA8"/>
-          <w:sz w:val="16"/>
+          <w:rFonts w:ascii="Arial" w:hAnsi="Arial"/>
+          <w:sz w:val="15"/>
         </w:rPr>
         <w:t>GitHub: https://github.com/mohammednafees1007-hub/fruit-quality-detector-for-sms</w:t>
       </w:r>
     </w:p>
     <w:p>
       <w:pPr>
-        <w:spacing w:after="0"/>
-        <w:ind w:left="0" w:firstLine="0"/>
+        <w:pStyle w:val="ListBullet"/>
+        <w:spacing w:after="10"/>
+        <w:ind w:left="187" w:hanging="187"/>
       </w:pPr>
       <w:r>
         <w:rPr>
-          <w:rFonts w:ascii="Arial" w:hAnsi="Arial" w:eastAsia="Arial"/>
-          <w:sz w:val="16"/>
+          <w:rFonts w:ascii="Arial" w:hAnsi="Arial"/>
+          <w:sz w:val="14"/>
         </w:rPr>
-        <w:t>- Built a quality-first fruit grading web system with upload/camera workflows, YOLOv8x fruit-region detection, a 3-class Keras quality model, A/B/C grade mapping, and annotated result output.</w:t>
+        <w:t>Developed a quality-first fruit grading system with image input workflows, YOLOv8x fruit-region detection, a 3-class Keras quality model, A/B/C grade mapping, and annotated result output.</w:t>
       </w:r>
     </w:p>
     <w:p>
-      <w:pPr>
-        <w:spacing w:after="0"/>
-      </w:pPr>
       <w:r>
         <w:rPr>
-          <w:rFonts w:ascii="Arial" w:hAnsi="Arial" w:eastAsia="Arial"/>
+          <w:rFonts w:ascii="Arial" w:hAnsi="Arial"/>
           <w:b/>
-          <w:sz w:val="17"/>
+          <w:sz w:val="15"/>
         </w:rPr>
         <w:t>AI Image Analyzer | Python, YOLOv8n, OpenCV, BLIP, Transformers</w:t>
       </w:r>
     </w:p>
     <w:p>
       <w:pPr>
-        <w:spacing w:after="0"/>
         <w:jc w:val="center"/>
       </w:pPr>
       <w:r>
         <w:rPr>
-          <w:rFonts w:ascii="Arial" w:hAnsi="Arial" w:eastAsia="Arial"/>
-          <w:i/>
-          <w:color w:val="1F5FA8"/>
-          <w:sz w:val="16"/>
+          <w:rFonts w:ascii="Arial" w:hAnsi="Arial"/>
+          <w:sz w:val="15"/>
         </w:rPr>
         <w:t>GitHub: https://github.com/mohammednafees1007-hub/ai-image-analyzer</w:t>
       </w:r>
     </w:p>
     <w:p>
       <w:pPr>
-        <w:spacing w:after="0"/>
-        <w:ind w:left="0" w:firstLine="0"/>
+        <w:pStyle w:val="ListBullet"/>
+        <w:spacing w:after="10"/>
+        <w:ind w:left="187" w:hanging="187"/>
       </w:pPr>
       <w:r>
         <w:rPr>
-          <w:rFonts w:ascii="Arial" w:hAnsi="Arial" w:eastAsia="Arial"/>
-          <w:sz w:val="16"/>
+          <w:rFonts w:ascii="Arial" w:hAnsi="Arial"/>
+          <w:sz w:val="14"/>
         </w:rPr>
-        <w:t>- Built a 3-stage backend image-analysis pipeline for a larger Visage project with YOLOv8n object detection, 13 allowed object classes, privacy-safe face tokens, BLIP captions, and 3-field JSON output.</w:t>
+        <w:t>Created a 3-stage backend image-analysis pipeline for a larger Visage project with YOLOv8n object detection, 13 allowed object classes, privacy-safe face tokens, BLIP captions, and structured app-ready output.</w:t>
       </w:r>
     </w:p>
     <w:p>
-      <w:pPr>
-        <w:spacing w:after="0"/>
-      </w:pPr>
       <w:r>
         <w:rPr>
-          <w:rFonts w:ascii="Arial" w:hAnsi="Arial" w:eastAsia="Arial"/>
+          <w:rFonts w:ascii="Arial" w:hAnsi="Arial"/>
           <w:b/>
-          <w:sz w:val="17"/>
+          <w:sz w:val="15"/>
         </w:rPr>
         <w:t>Quadruped Robot | Inverse Kinematics, Robotics Controls, Embedded Integration</w:t>
       </w:r>
     </w:p>
     <w:p>
       <w:pPr>
-        <w:spacing w:after="0"/>
-        <w:ind w:left="0" w:firstLine="0"/>
+        <w:pStyle w:val="ListBullet"/>
+        <w:spacing w:after="10"/>
+        <w:ind w:left="187" w:hanging="187"/>
       </w:pPr>
       <w:r>
         <w:rPr>
-          <w:rFonts w:ascii="Arial" w:hAnsi="Arial" w:eastAsia="Arial"/>
-          <w:sz w:val="16"/>
+          <w:rFonts w:ascii="Arial" w:hAnsi="Arial"/>
+          <w:sz w:val="14"/>
         </w:rPr>
-        <w:t>- Built inverse-kinematics motion logic for leg movement, connecting control theory with practical actuation for stable quadruped locomotion.</w:t>
+        <w:t>Implemented inverse-kinematics motion logic for leg movement, connecting control theory with practical actuation for stable quadruped locomotion.</w:t>
       </w:r>
     </w:p>
     <w:p>
-      <w:pPr>
-        <w:spacing w:after="0"/>
-      </w:pPr>
       <w:r>
         <w:rPr>
-          <w:rFonts w:ascii="Arial" w:hAnsi="Arial" w:eastAsia="Arial"/>
+          <w:rFonts w:ascii="Arial" w:hAnsi="Arial"/>
           <w:b/>
-          <w:sz w:val="17"/>
+          <w:sz w:val="15"/>
         </w:rPr>
         <w:t>Schooling-Era Robotics Projects | Arduino, Sensors, Motor Drivers</w:t>
       </w:r>
     </w:p>
     <w:p>
       <w:pPr>
-        <w:spacing w:after="0"/>
-        <w:ind w:left="0" w:firstLine="0"/>
+        <w:pStyle w:val="ListBullet"/>
+        <w:spacing w:after="10"/>
+        <w:ind w:left="187" w:hanging="187"/>
       </w:pPr>
       <w:r>
         <w:rPr>
-          <w:rFonts w:ascii="Arial" w:hAnsi="Arial" w:eastAsia="Arial"/>
-          <w:sz w:val="16"/>
+          <w:rFonts w:ascii="Arial" w:hAnsi="Arial"/>
+          <w:sz w:val="14"/>
         </w:rPr>
-        <w:t>- Completed early Arduino robotics prototypes involving sensors, motor drivers, wiring, control experiments, and debugging.</w:t>
+        <w:t>Prototyped early Arduino robotics systems involving sensors, motor drivers, wiring, control experiments, and debugging.</w:t>
       </w:r>
     </w:p>
     <w:p>
       <w:pPr>
-        <w:spacing w:before="60" w:after="0"/>
+        <w:spacing w:before="44" w:after="16"/>
         <w:pBdr>
-          <w:bottom w:val="single" w:sz="4" w:space="1" w:color="666666"/>
+          <w:bottom w:val="single" w:sz="4" w:space="1" w:color="000000"/>
         </w:pBdr>
       </w:pPr>
       <w:r>
         <w:rPr>
-          <w:rFonts w:ascii="Arial" w:hAnsi="Arial" w:eastAsia="Arial"/>
+          <w:rFonts w:ascii="Arial" w:hAnsi="Arial"/>
           <w:b/>
-          <w:sz w:val="19"/>
+          <w:sz w:val="16"/>
         </w:rPr>
         <w:t>LEADERSHIP AND INVOLVEMENT</w:t>
       </w:r>
     </w:p>
     <w:p>
-      <w:pPr>
-        <w:spacing w:after="0"/>
-      </w:pPr>
       <w:r>
         <w:rPr>
-          <w:rFonts w:ascii="Arial" w:hAnsi="Arial" w:eastAsia="Arial"/>
+          <w:rFonts w:ascii="Arial" w:hAnsi="Arial"/>
           <w:b/>
-          <w:sz w:val="17"/>
+          <w:sz w:val="15"/>
         </w:rPr>
         <w:t>Robotics Club Member | SASTRA Deemed University</w:t>
       </w:r>
     </w:p>
     <w:p>
       <w:pPr>
-        <w:spacing w:after="0"/>
-        <w:ind w:left="0" w:firstLine="0"/>
+        <w:pStyle w:val="ListBullet"/>
+        <w:spacing w:after="10"/>
+        <w:ind w:left="187" w:hanging="187"/>
       </w:pPr>
       <w:r>
         <w:rPr>
-          <w:rFonts w:ascii="Arial" w:hAnsi="Arial" w:eastAsia="Arial"/>
-          <w:sz w:val="16"/>
+          <w:rFonts w:ascii="Arial" w:hAnsi="Arial"/>
+          <w:sz w:val="14"/>
         </w:rPr>
-        <w:t>- Active in robotics learning, project building, experimentation, and applied technical development.</w:t>
+        <w:t>Active in robotics learning, project building, experimentation, and applied technical development.</w:t>
       </w:r>
     </w:p>
     <w:p>
       <w:pPr>
-        <w:spacing w:before="60" w:after="0"/>
+        <w:spacing w:before="44" w:after="16"/>
         <w:pBdr>
-          <w:bottom w:val="single" w:sz="4" w:space="1" w:color="666666"/>
+          <w:bottom w:val="single" w:sz="4" w:space="1" w:color="000000"/>
         </w:pBdr>
       </w:pPr>
       <w:r>
         <w:rPr>
-          <w:rFonts w:ascii="Arial" w:hAnsi="Arial" w:eastAsia="Arial"/>
+          <w:rFonts w:ascii="Arial" w:hAnsi="Arial"/>
           <w:b/>
-          <w:sz w:val="19"/>
+          <w:sz w:val="16"/>
         </w:rPr>
         <w:t>ENGINEERING HIGHLIGHTS</w:t>
       </w:r>
     </w:p>
     <w:p>
       <w:pPr>
-        <w:spacing w:after="0"/>
-        <w:ind w:left="0" w:firstLine="0"/>
+        <w:pStyle w:val="ListBullet"/>
+        <w:spacing w:after="10"/>
+        <w:ind w:left="187" w:hanging="187"/>
       </w:pPr>
       <w:r>
         <w:rPr>
-          <w:rFonts w:ascii="Arial" w:hAnsi="Arial" w:eastAsia="Arial"/>
-          <w:sz w:val="16"/>
+          <w:rFonts w:ascii="Arial" w:hAnsi="Arial"/>
+          <w:sz w:val="14"/>
         </w:rPr>
-        <w:t>- Practical builder across robotics software, embedded electronics, mechanical integration, AI models, and user-facing tools.</w:t>
+        <w:t>Practical builder across robotics software, embedded electronics, mechanical integration, AI models, and user-facing tools.</w:t>
       </w:r>
     </w:p>
     <w:p>
       <w:pPr>
-        <w:spacing w:after="0"/>
-        <w:ind w:left="0" w:firstLine="0"/>
+        <w:pStyle w:val="ListBullet"/>
+        <w:spacing w:after="10"/>
+        <w:ind w:left="187" w:hanging="187"/>
       </w:pPr>
       <w:r>
         <w:rPr>
-          <w:rFonts w:ascii="Arial" w:hAnsi="Arial" w:eastAsia="Arial"/>
-          <w:sz w:val="16"/>
+          <w:rFonts w:ascii="Arial" w:hAnsi="Arial"/>
+          <w:sz w:val="14"/>
         </w:rPr>
-        <w:t>- Comfortable with Linux robotics environments, hardware bring-up, sensor debugging, serial communication, rapid prototyping, and deployment-oriented project work.</w:t>
+        <w:t>Comfortable with Linux robotics environments, hardware bring-up, sensor debugging, serial communication, rapid prototyping, and deployment-oriented project work.</w:t>
       </w:r>
     </w:p>
     <w:p>
       <w:pPr>
-        <w:spacing w:after="0"/>
-        <w:ind w:left="0" w:firstLine="0"/>
+        <w:pStyle w:val="ListBullet"/>
+        <w:spacing w:after="10"/>
+        <w:ind w:left="187" w:hanging="187"/>
       </w:pPr>
       <w:r>
         <w:rPr>
-          <w:rFonts w:ascii="Arial" w:hAnsi="Arial" w:eastAsia="Arial"/>
-          <w:sz w:val="16"/>
+          <w:rFonts w:ascii="Arial" w:hAnsi="Arial"/>
+          <w:sz w:val="14"/>
         </w:rPr>
-        <w:t>- Strong project evidence through public GitHub repositories, runnable local applications, backend pipelines, and real hardware workflows.</w:t>
+        <w:t>Strong project evidence through public GitHub repositories, runnable local applications, backend pipelines, and real hardware workflows.</w:t>
       </w:r>
     </w:p>
     <w:sectPr>
       <w:pgSz w:w="12240" w:h="15840"/>
-      <w:pgMar w:top="605" w:right="749" w:bottom="605" w:left="749" w:header="720" w:footer="720" w:gutter="0"/>
+      <w:pgMar w:top="547" w:right="691" w:bottom="504" w:left="691" w:header="720" w:footer="720" w:gutter="0"/>
       <w:cols w:space="720"/>
       <w:docGrid w:linePitch="360"/>
     </w:sectPr>
@@ -970,11 +926,11 @@
     <w:qFormat/>
     <w:rsid w:val="00FC693F"/>
     <w:pPr>
-      <w:spacing w:after="0" w:line="240" w:lineRule="auto"/>
+      <w:spacing w:after="24" w:line="223" w:lineRule="auto"/>
     </w:pPr>
     <w:rPr>
       <w:rFonts w:ascii="Arial" w:hAnsi="Arial" w:eastAsia="Arial"/>
-      <w:sz w:val="17"/>
+      <w:sz w:val="15"/>
     </w:rPr>
   </w:style>
   <w:style w:type="paragraph" w:styleId="Header">

</xml_diff>

<commit_message>
docs: increase master resume typography
</commit_message>
<xml_diff>
--- a/resumes/Mohammed_Nafees_H_Master_ATS.docx
+++ b/resumes/Mohammed_Nafees_H_Master_ATS.docx
@@ -4,68 +4,73 @@
   <w:body>
     <w:p>
       <w:pPr>
+        <w:spacing w:after="20"/>
         <w:jc w:val="center"/>
       </w:pPr>
       <w:r>
         <w:rPr>
           <w:rFonts w:ascii="Arial" w:hAnsi="Arial"/>
           <w:b/>
-          <w:sz w:val="30"/>
+          <w:sz w:val="35"/>
         </w:rPr>
         <w:t>MOHAMMED NAFEES H</w:t>
       </w:r>
     </w:p>
     <w:p>
       <w:pPr>
+        <w:spacing w:after="26" w:line="245" w:lineRule="auto"/>
         <w:jc w:val="center"/>
       </w:pPr>
       <w:r>
         <w:rPr>
           <w:rFonts w:ascii="Arial" w:hAnsi="Arial"/>
-          <w:sz w:val="15"/>
+          <w:sz w:val="17"/>
         </w:rPr>
         <w:t>Robotics Engineering / Robotics Software / Embedded Robotics Intern</w:t>
       </w:r>
     </w:p>
     <w:p>
       <w:pPr>
+        <w:spacing w:after="26" w:line="245" w:lineRule="auto"/>
         <w:jc w:val="center"/>
       </w:pPr>
       <w:r>
         <w:rPr>
           <w:rFonts w:ascii="Arial" w:hAnsi="Arial"/>
-          <w:sz w:val="15"/>
+          <w:sz w:val="17"/>
         </w:rPr>
         <w:t>Phone: +91 962-946-1267 | Email: mohammednafees1007@gmail.com | Location: Kumbakonam, Tamil Nadu, India</w:t>
       </w:r>
     </w:p>
     <w:p>
       <w:pPr>
+        <w:spacing w:after="26" w:line="245" w:lineRule="auto"/>
         <w:jc w:val="center"/>
       </w:pPr>
       <w:r>
         <w:rPr>
           <w:rFonts w:ascii="Arial" w:hAnsi="Arial"/>
-          <w:sz w:val="15"/>
+          <w:sz w:val="17"/>
         </w:rPr>
         <w:t>LinkedIn: https://www.linkedin.com/in/mohammed-nafees-h-7b3377306</w:t>
       </w:r>
     </w:p>
     <w:p>
       <w:pPr>
+        <w:spacing w:after="26" w:line="245" w:lineRule="auto"/>
         <w:jc w:val="center"/>
       </w:pPr>
       <w:r>
         <w:rPr>
           <w:rFonts w:ascii="Arial" w:hAnsi="Arial"/>
-          <w:sz w:val="15"/>
+          <w:sz w:val="17"/>
         </w:rPr>
         <w:t>GitHub: https://github.com/mohammednafees1007-hub</w:t>
       </w:r>
     </w:p>
     <w:p>
       <w:pPr>
-        <w:spacing w:before="44" w:after="16"/>
+        <w:spacing w:before="64" w:after="32"/>
         <w:pBdr>
           <w:bottom w:val="single" w:sz="4" w:space="1" w:color="000000"/>
         </w:pBdr>
@@ -74,23 +79,26 @@
         <w:rPr>
           <w:rFonts w:ascii="Arial" w:hAnsi="Arial"/>
           <w:b/>
-          <w:sz w:val="16"/>
+          <w:sz w:val="19"/>
         </w:rPr>
         <w:t>PROFESSIONAL SUMMARY</w:t>
       </w:r>
     </w:p>
     <w:p>
+      <w:pPr>
+        <w:spacing w:after="26" w:line="245" w:lineRule="auto"/>
+      </w:pPr>
       <w:r>
         <w:rPr>
           <w:rFonts w:ascii="Arial" w:hAnsi="Arial"/>
-          <w:sz w:val="15"/>
+          <w:sz w:val="17"/>
         </w:rPr>
         <w:t>B.Tech Robotics &amp; Artificial Intelligence student at SASTRA University, Class of 2028, targeting robotics engineering, robotics software, and embedded robotics internships. Hands-on experience across ROS 2 workflows, Python/C++ robotics programming, embedded hardware, sensors, motor control, computer vision, and AI backend pipelines. Engineered a 4x4 Arduino-Python autonomous navigation robot, a 3-class fruit quality grading system, and a 3-stage YOLO/OpenCV/BLIP image-analysis backend for a larger Visage project.</w:t>
       </w:r>
     </w:p>
     <w:p>
       <w:pPr>
-        <w:spacing w:before="44" w:after="16"/>
+        <w:spacing w:before="64" w:after="32"/>
         <w:pBdr>
           <w:bottom w:val="single" w:sz="4" w:space="1" w:color="000000"/>
         </w:pBdr>
@@ -99,24 +107,27 @@
         <w:rPr>
           <w:rFonts w:ascii="Arial" w:hAnsi="Arial"/>
           <w:b/>
-          <w:sz w:val="16"/>
+          <w:sz w:val="19"/>
         </w:rPr>
         <w:t>EDUCATION</w:t>
       </w:r>
     </w:p>
     <w:p>
+      <w:pPr>
+        <w:spacing w:after="26" w:line="245" w:lineRule="auto"/>
+      </w:pPr>
       <w:r>
         <w:rPr>
           <w:rFonts w:ascii="Arial" w:hAnsi="Arial"/>
           <w:b/>
-          <w:sz w:val="15"/>
+          <w:sz w:val="17"/>
         </w:rPr>
         <w:t>SASTRA Deemed University | B.Tech, Robotics &amp; Artificial Intelligence | Aug 2024 - May 2028 | Tamil Nadu, India</w:t>
       </w:r>
     </w:p>
     <w:p>
       <w:pPr>
-        <w:spacing w:before="44" w:after="16"/>
+        <w:spacing w:before="64" w:after="32"/>
         <w:pBdr>
           <w:bottom w:val="single" w:sz="4" w:space="1" w:color="000000"/>
         </w:pBdr>
@@ -125,7 +136,7 @@
         <w:rPr>
           <w:rFonts w:ascii="Arial" w:hAnsi="Arial"/>
           <w:b/>
-          <w:sz w:val="16"/>
+          <w:sz w:val="19"/>
         </w:rPr>
         <w:t>TECHNICAL SKILLS</w:t>
       </w:r>
@@ -133,13 +144,13 @@
     <w:p>
       <w:pPr>
         <w:pStyle w:val="ListBullet"/>
-        <w:spacing w:after="10"/>
-        <w:ind w:left="187" w:hanging="187"/>
+        <w:spacing w:after="20" w:line="245" w:lineRule="auto"/>
+        <w:ind w:left="230" w:hanging="230"/>
       </w:pPr>
       <w:r>
         <w:rPr>
           <w:rFonts w:ascii="Arial" w:hAnsi="Arial"/>
-          <w:sz w:val="14"/>
+          <w:sz w:val="17"/>
         </w:rPr>
         <w:t>Robotics Software: ROS 2, Python, C/C++, Linux/Ubuntu, Git, robot integration, A* path planning, controls basics, sensor debugging</w:t>
       </w:r>
@@ -147,13 +158,13 @@
     <w:p>
       <w:pPr>
         <w:pStyle w:val="ListBullet"/>
-        <w:spacing w:after="10"/>
-        <w:ind w:left="187" w:hanging="187"/>
+        <w:spacing w:after="20" w:line="245" w:lineRule="auto"/>
+        <w:ind w:left="230" w:hanging="230"/>
       </w:pPr>
       <w:r>
         <w:rPr>
           <w:rFonts w:ascii="Arial" w:hAnsi="Arial"/>
-          <w:sz w:val="14"/>
+          <w:sz w:val="17"/>
         </w:rPr>
         <w:t>Embedded Hardware: Arduino, ESP32, STM32, Raspberry Pi 5, Raspberry Pi Zero 2 W, Pi Camera, GPIO, motor drivers, encoders, IR sensors</w:t>
       </w:r>
@@ -161,13 +172,13 @@
     <w:p>
       <w:pPr>
         <w:pStyle w:val="ListBullet"/>
-        <w:spacing w:after="10"/>
-        <w:ind w:left="187" w:hanging="187"/>
+        <w:spacing w:after="20" w:line="245" w:lineRule="auto"/>
+        <w:ind w:left="230" w:hanging="230"/>
       </w:pPr>
       <w:r>
         <w:rPr>
           <w:rFonts w:ascii="Arial" w:hAnsi="Arial"/>
-          <w:sz w:val="14"/>
+          <w:sz w:val="17"/>
         </w:rPr>
         <w:t>Communication &amp; Sensors: I2C, UART, LiDAR, IMU, camera sensors, serial communication, sensor/actuator interfacing</w:t>
       </w:r>
@@ -175,13 +186,13 @@
     <w:p>
       <w:pPr>
         <w:pStyle w:val="ListBullet"/>
-        <w:spacing w:after="10"/>
-        <w:ind w:left="187" w:hanging="187"/>
+        <w:spacing w:after="20" w:line="245" w:lineRule="auto"/>
+        <w:ind w:left="230" w:hanging="230"/>
       </w:pPr>
       <w:r>
         <w:rPr>
           <w:rFonts w:ascii="Arial" w:hAnsi="Arial"/>
-          <w:sz w:val="14"/>
+          <w:sz w:val="17"/>
         </w:rPr>
         <w:t>Hardware Lab Exposure: soldering, schematic reading, hardware bring-up, wiring, component evaluation, procurement coordination</w:t>
       </w:r>
@@ -189,13 +200,13 @@
     <w:p>
       <w:pPr>
         <w:pStyle w:val="ListBullet"/>
-        <w:spacing w:after="10"/>
-        <w:ind w:left="187" w:hanging="187"/>
+        <w:spacing w:after="20" w:line="245" w:lineRule="auto"/>
+        <w:ind w:left="230" w:hanging="230"/>
       </w:pPr>
       <w:r>
         <w:rPr>
           <w:rFonts w:ascii="Arial" w:hAnsi="Arial"/>
-          <w:sz w:val="14"/>
+          <w:sz w:val="17"/>
         </w:rPr>
         <w:t>AI &amp; Computer Vision: OpenCV, YOLOv8, Ultralytics, TensorFlow/Keras, CLIP, BLIP, Hugging Face Transformers, image classification, object detection, scene captioning</w:t>
       </w:r>
@@ -203,20 +214,20 @@
     <w:p>
       <w:pPr>
         <w:pStyle w:val="ListBullet"/>
-        <w:spacing w:after="10"/>
-        <w:ind w:left="187" w:hanging="187"/>
+        <w:spacing w:after="20" w:line="245" w:lineRule="auto"/>
+        <w:ind w:left="230" w:hanging="230"/>
       </w:pPr>
       <w:r>
         <w:rPr>
           <w:rFonts w:ascii="Arial" w:hAnsi="Arial"/>
-          <w:sz w:val="14"/>
+          <w:sz w:val="17"/>
         </w:rPr>
         <w:t>Tools: VS Code, Ubuntu 24.04, CoppeliaSim, Fusion 360, EasyEDA/KiCad basics</w:t>
       </w:r>
     </w:p>
     <w:p>
       <w:pPr>
-        <w:spacing w:before="44" w:after="16"/>
+        <w:spacing w:before="64" w:after="32"/>
         <w:pBdr>
           <w:bottom w:val="single" w:sz="4" w:space="1" w:color="000000"/>
         </w:pBdr>
@@ -225,17 +236,20 @@
         <w:rPr>
           <w:rFonts w:ascii="Arial" w:hAnsi="Arial"/>
           <w:b/>
-          <w:sz w:val="16"/>
+          <w:sz w:val="19"/>
         </w:rPr>
         <w:t>EXPERIENCE</w:t>
       </w:r>
     </w:p>
     <w:p>
+      <w:pPr>
+        <w:spacing w:after="26" w:line="245" w:lineRule="auto"/>
+      </w:pPr>
       <w:r>
         <w:rPr>
           <w:rFonts w:ascii="Arial" w:hAnsi="Arial"/>
           <w:b/>
-          <w:sz w:val="15"/>
+          <w:sz w:val="17"/>
         </w:rPr>
         <w:t>Industrial Robotics Engineering Project | Robotics Engineering Contributor | ROS 2, Controls, Embedded Integration</w:t>
       </w:r>
@@ -243,13 +257,13 @@
     <w:p>
       <w:pPr>
         <w:pStyle w:val="ListBullet"/>
-        <w:spacing w:after="10"/>
-        <w:ind w:left="187" w:hanging="187"/>
+        <w:spacing w:after="20" w:line="245" w:lineRule="auto"/>
+        <w:ind w:left="230" w:hanging="230"/>
       </w:pPr>
       <w:r>
         <w:rPr>
           <w:rFonts w:ascii="Arial" w:hAnsi="Arial"/>
-          <w:sz w:val="14"/>
+          <w:sz w:val="17"/>
         </w:rPr>
         <w:t>Contribute to ROS 2 based robotics workflows, controls-oriented development, embedded integration, sensor/actuator evaluation, and hardware coordination under professional constraints.</w:t>
       </w:r>
@@ -257,13 +271,13 @@
     <w:p>
       <w:pPr>
         <w:pStyle w:val="ListBullet"/>
-        <w:spacing w:after="10"/>
-        <w:ind w:left="187" w:hanging="187"/>
+        <w:spacing w:after="20" w:line="245" w:lineRule="auto"/>
+        <w:ind w:left="230" w:hanging="230"/>
       </w:pPr>
       <w:r>
         <w:rPr>
           <w:rFonts w:ascii="Arial" w:hAnsi="Arial"/>
-          <w:sz w:val="14"/>
+          <w:sz w:val="17"/>
         </w:rPr>
         <w:t>Coordinate component identification, evaluation, and procurement support for a project hardware budget of approximately Rs. 10 lakh.</w:t>
       </w:r>
@@ -271,20 +285,20 @@
     <w:p>
       <w:pPr>
         <w:pStyle w:val="ListBullet"/>
-        <w:spacing w:after="10"/>
-        <w:ind w:left="187" w:hanging="187"/>
+        <w:spacing w:after="20" w:line="245" w:lineRule="auto"/>
+        <w:ind w:left="230" w:hanging="230"/>
       </w:pPr>
       <w:r>
         <w:rPr>
           <w:rFonts w:ascii="Arial" w:hAnsi="Arial"/>
-          <w:sz w:val="14"/>
+          <w:sz w:val="17"/>
         </w:rPr>
         <w:t>Work across robotics software, electronics, and mechanical constraints for deployment-oriented industrial robotics tasks.</w:t>
       </w:r>
     </w:p>
     <w:p>
       <w:pPr>
-        <w:spacing w:before="44" w:after="16"/>
+        <w:spacing w:before="64" w:after="32"/>
         <w:pBdr>
           <w:bottom w:val="single" w:sz="4" w:space="1" w:color="000000"/>
         </w:pBdr>
@@ -293,29 +307,33 @@
         <w:rPr>
           <w:rFonts w:ascii="Arial" w:hAnsi="Arial"/>
           <w:b/>
-          <w:sz w:val="16"/>
+          <w:sz w:val="19"/>
         </w:rPr>
         <w:t>PROJECTS</w:t>
       </w:r>
     </w:p>
     <w:p>
+      <w:pPr>
+        <w:spacing w:after="26" w:line="245" w:lineRule="auto"/>
+      </w:pPr>
       <w:r>
         <w:rPr>
           <w:rFonts w:ascii="Arial" w:hAnsi="Arial"/>
           <w:b/>
-          <w:sz w:val="15"/>
+          <w:sz w:val="17"/>
         </w:rPr>
         <w:t>Hadi Al Hajatron | Arduino, Python, IR Sensors, Encoders, A* Path Planning</w:t>
       </w:r>
     </w:p>
     <w:p>
       <w:pPr>
+        <w:spacing w:after="26" w:line="245" w:lineRule="auto"/>
         <w:jc w:val="center"/>
       </w:pPr>
       <w:r>
         <w:rPr>
           <w:rFonts w:ascii="Arial" w:hAnsi="Arial"/>
-          <w:sz w:val="15"/>
+          <w:sz w:val="17"/>
         </w:rPr>
         <w:t>GitHub: https://github.com/mohammednafees1007-hub/Hadi-Al-Hajatron</w:t>
       </w:r>
@@ -323,35 +341,39 @@
     <w:p>
       <w:pPr>
         <w:pStyle w:val="ListBullet"/>
-        <w:spacing w:after="10"/>
-        <w:ind w:left="187" w:hanging="187"/>
+        <w:spacing w:after="20" w:line="245" w:lineRule="auto"/>
+        <w:ind w:left="230" w:hanging="230"/>
       </w:pPr>
       <w:r>
         <w:rPr>
           <w:rFonts w:ascii="Arial" w:hAnsi="Arial"/>
-          <w:sz w:val="14"/>
+          <w:sz w:val="17"/>
         </w:rPr>
         <w:t>Engineered a 4x4 Arduino-Python autonomous grid-navigation robot with 3 IR obstacle sensors, 60 cm calibrated movement steps, live mapping, map export, and A* route planning.</w:t>
       </w:r>
     </w:p>
     <w:p>
+      <w:pPr>
+        <w:spacing w:after="26" w:line="245" w:lineRule="auto"/>
+      </w:pPr>
       <w:r>
         <w:rPr>
           <w:rFonts w:ascii="Arial" w:hAnsi="Arial"/>
           <w:b/>
-          <w:sz w:val="15"/>
+          <w:sz w:val="17"/>
         </w:rPr>
         <w:t>FruitVision AI - Fruit Quality Detector for SMS | YOLOv8x, Keras, CLIP, OpenCV</w:t>
       </w:r>
     </w:p>
     <w:p>
       <w:pPr>
+        <w:spacing w:after="26" w:line="245" w:lineRule="auto"/>
         <w:jc w:val="center"/>
       </w:pPr>
       <w:r>
         <w:rPr>
           <w:rFonts w:ascii="Arial" w:hAnsi="Arial"/>
-          <w:sz w:val="15"/>
+          <w:sz w:val="17"/>
         </w:rPr>
         <w:t>GitHub: https://github.com/mohammednafees1007-hub/fruit-quality-detector-for-sms</w:t>
       </w:r>
@@ -359,35 +381,39 @@
     <w:p>
       <w:pPr>
         <w:pStyle w:val="ListBullet"/>
-        <w:spacing w:after="10"/>
-        <w:ind w:left="187" w:hanging="187"/>
+        <w:spacing w:after="20" w:line="245" w:lineRule="auto"/>
+        <w:ind w:left="230" w:hanging="230"/>
       </w:pPr>
       <w:r>
         <w:rPr>
           <w:rFonts w:ascii="Arial" w:hAnsi="Arial"/>
-          <w:sz w:val="14"/>
+          <w:sz w:val="17"/>
         </w:rPr>
         <w:t>Developed a quality-first fruit grading system with image input workflows, YOLOv8x fruit-region detection, a 3-class Keras quality model, A/B/C grade mapping, and annotated result output.</w:t>
       </w:r>
     </w:p>
     <w:p>
+      <w:pPr>
+        <w:spacing w:after="26" w:line="245" w:lineRule="auto"/>
+      </w:pPr>
       <w:r>
         <w:rPr>
           <w:rFonts w:ascii="Arial" w:hAnsi="Arial"/>
           <w:b/>
-          <w:sz w:val="15"/>
+          <w:sz w:val="17"/>
         </w:rPr>
         <w:t>AI Image Analyzer | Python, YOLOv8n, OpenCV, BLIP, Transformers</w:t>
       </w:r>
     </w:p>
     <w:p>
       <w:pPr>
+        <w:spacing w:after="26" w:line="245" w:lineRule="auto"/>
         <w:jc w:val="center"/>
       </w:pPr>
       <w:r>
         <w:rPr>
           <w:rFonts w:ascii="Arial" w:hAnsi="Arial"/>
-          <w:sz w:val="15"/>
+          <w:sz w:val="17"/>
         </w:rPr>
         <w:t>GitHub: https://github.com/mohammednafees1007-hub/ai-image-analyzer</w:t>
       </w:r>
@@ -395,23 +421,26 @@
     <w:p>
       <w:pPr>
         <w:pStyle w:val="ListBullet"/>
-        <w:spacing w:after="10"/>
-        <w:ind w:left="187" w:hanging="187"/>
+        <w:spacing w:after="20" w:line="245" w:lineRule="auto"/>
+        <w:ind w:left="230" w:hanging="230"/>
       </w:pPr>
       <w:r>
         <w:rPr>
           <w:rFonts w:ascii="Arial" w:hAnsi="Arial"/>
-          <w:sz w:val="14"/>
+          <w:sz w:val="17"/>
         </w:rPr>
         <w:t>Created a 3-stage backend image-analysis pipeline for a larger Visage project with YOLOv8n object detection, 13 allowed object classes, privacy-safe face tokens, BLIP captions, and structured app-ready output.</w:t>
       </w:r>
     </w:p>
     <w:p>
+      <w:pPr>
+        <w:spacing w:after="26" w:line="245" w:lineRule="auto"/>
+      </w:pPr>
       <w:r>
         <w:rPr>
           <w:rFonts w:ascii="Arial" w:hAnsi="Arial"/>
           <w:b/>
-          <w:sz w:val="15"/>
+          <w:sz w:val="17"/>
         </w:rPr>
         <w:t>Quadruped Robot | Inverse Kinematics, Robotics Controls, Embedded Integration</w:t>
       </w:r>
@@ -419,23 +448,26 @@
     <w:p>
       <w:pPr>
         <w:pStyle w:val="ListBullet"/>
-        <w:spacing w:after="10"/>
-        <w:ind w:left="187" w:hanging="187"/>
+        <w:spacing w:after="20" w:line="245" w:lineRule="auto"/>
+        <w:ind w:left="230" w:hanging="230"/>
       </w:pPr>
       <w:r>
         <w:rPr>
           <w:rFonts w:ascii="Arial" w:hAnsi="Arial"/>
-          <w:sz w:val="14"/>
+          <w:sz w:val="17"/>
         </w:rPr>
         <w:t>Implemented inverse-kinematics motion logic for leg movement, connecting control theory with practical actuation for stable quadruped locomotion.</w:t>
       </w:r>
     </w:p>
     <w:p>
+      <w:pPr>
+        <w:spacing w:after="26" w:line="245" w:lineRule="auto"/>
+      </w:pPr>
       <w:r>
         <w:rPr>
           <w:rFonts w:ascii="Arial" w:hAnsi="Arial"/>
           <w:b/>
-          <w:sz w:val="15"/>
+          <w:sz w:val="17"/>
         </w:rPr>
         <w:t>Schooling-Era Robotics Projects | Arduino, Sensors, Motor Drivers</w:t>
       </w:r>
@@ -443,20 +475,20 @@
     <w:p>
       <w:pPr>
         <w:pStyle w:val="ListBullet"/>
-        <w:spacing w:after="10"/>
-        <w:ind w:left="187" w:hanging="187"/>
+        <w:spacing w:after="20" w:line="245" w:lineRule="auto"/>
+        <w:ind w:left="230" w:hanging="230"/>
       </w:pPr>
       <w:r>
         <w:rPr>
           <w:rFonts w:ascii="Arial" w:hAnsi="Arial"/>
-          <w:sz w:val="14"/>
+          <w:sz w:val="17"/>
         </w:rPr>
         <w:t>Prototyped early Arduino robotics systems involving sensors, motor drivers, wiring, control experiments, and debugging.</w:t>
       </w:r>
     </w:p>
     <w:p>
       <w:pPr>
-        <w:spacing w:before="44" w:after="16"/>
+        <w:spacing w:before="64" w:after="32"/>
         <w:pBdr>
           <w:bottom w:val="single" w:sz="4" w:space="1" w:color="000000"/>
         </w:pBdr>
@@ -465,17 +497,20 @@
         <w:rPr>
           <w:rFonts w:ascii="Arial" w:hAnsi="Arial"/>
           <w:b/>
-          <w:sz w:val="16"/>
+          <w:sz w:val="19"/>
         </w:rPr>
         <w:t>LEADERSHIP AND INVOLVEMENT</w:t>
       </w:r>
     </w:p>
     <w:p>
+      <w:pPr>
+        <w:spacing w:after="26" w:line="245" w:lineRule="auto"/>
+      </w:pPr>
       <w:r>
         <w:rPr>
           <w:rFonts w:ascii="Arial" w:hAnsi="Arial"/>
           <w:b/>
-          <w:sz w:val="15"/>
+          <w:sz w:val="17"/>
         </w:rPr>
         <w:t>Robotics Club Member | SASTRA Deemed University</w:t>
       </w:r>
@@ -483,20 +518,20 @@
     <w:p>
       <w:pPr>
         <w:pStyle w:val="ListBullet"/>
-        <w:spacing w:after="10"/>
-        <w:ind w:left="187" w:hanging="187"/>
+        <w:spacing w:after="20" w:line="245" w:lineRule="auto"/>
+        <w:ind w:left="230" w:hanging="230"/>
       </w:pPr>
       <w:r>
         <w:rPr>
           <w:rFonts w:ascii="Arial" w:hAnsi="Arial"/>
-          <w:sz w:val="14"/>
+          <w:sz w:val="17"/>
         </w:rPr>
         <w:t>Active in robotics learning, project building, experimentation, and applied technical development.</w:t>
       </w:r>
     </w:p>
     <w:p>
       <w:pPr>
-        <w:spacing w:before="44" w:after="16"/>
+        <w:spacing w:before="64" w:after="32"/>
         <w:pBdr>
           <w:bottom w:val="single" w:sz="4" w:space="1" w:color="000000"/>
         </w:pBdr>
@@ -505,7 +540,7 @@
         <w:rPr>
           <w:rFonts w:ascii="Arial" w:hAnsi="Arial"/>
           <w:b/>
-          <w:sz w:val="16"/>
+          <w:sz w:val="19"/>
         </w:rPr>
         <w:t>ENGINEERING HIGHLIGHTS</w:t>
       </w:r>
@@ -513,13 +548,13 @@
     <w:p>
       <w:pPr>
         <w:pStyle w:val="ListBullet"/>
-        <w:spacing w:after="10"/>
-        <w:ind w:left="187" w:hanging="187"/>
+        <w:spacing w:after="20" w:line="245" w:lineRule="auto"/>
+        <w:ind w:left="230" w:hanging="230"/>
       </w:pPr>
       <w:r>
         <w:rPr>
           <w:rFonts w:ascii="Arial" w:hAnsi="Arial"/>
-          <w:sz w:val="14"/>
+          <w:sz w:val="17"/>
         </w:rPr>
         <w:t>Practical builder across robotics software, embedded electronics, mechanical integration, AI models, and user-facing tools.</w:t>
       </w:r>
@@ -527,13 +562,13 @@
     <w:p>
       <w:pPr>
         <w:pStyle w:val="ListBullet"/>
-        <w:spacing w:after="10"/>
-        <w:ind w:left="187" w:hanging="187"/>
+        <w:spacing w:after="20" w:line="245" w:lineRule="auto"/>
+        <w:ind w:left="230" w:hanging="230"/>
       </w:pPr>
       <w:r>
         <w:rPr>
           <w:rFonts w:ascii="Arial" w:hAnsi="Arial"/>
-          <w:sz w:val="14"/>
+          <w:sz w:val="17"/>
         </w:rPr>
         <w:t>Comfortable with Linux robotics environments, hardware bring-up, sensor debugging, serial communication, rapid prototyping, and deployment-oriented project work.</w:t>
       </w:r>
@@ -541,20 +576,20 @@
     <w:p>
       <w:pPr>
         <w:pStyle w:val="ListBullet"/>
-        <w:spacing w:after="10"/>
-        <w:ind w:left="187" w:hanging="187"/>
+        <w:spacing w:after="20" w:line="245" w:lineRule="auto"/>
+        <w:ind w:left="230" w:hanging="230"/>
       </w:pPr>
       <w:r>
         <w:rPr>
           <w:rFonts w:ascii="Arial" w:hAnsi="Arial"/>
-          <w:sz w:val="14"/>
+          <w:sz w:val="17"/>
         </w:rPr>
         <w:t>Strong project evidence through public GitHub repositories, runnable local applications, backend pipelines, and real hardware workflows.</w:t>
       </w:r>
     </w:p>
     <w:sectPr>
       <w:pgSz w:w="12240" w:h="15840"/>
-      <w:pgMar w:top="547" w:right="691" w:bottom="504" w:left="691" w:header="720" w:footer="720" w:gutter="0"/>
+      <w:pgMar w:top="648" w:right="792" w:bottom="605" w:left="792" w:header="720" w:footer="720" w:gutter="0"/>
       <w:cols w:space="720"/>
       <w:docGrid w:linePitch="360"/>
     </w:sectPr>
@@ -926,11 +961,11 @@
     <w:qFormat/>
     <w:rsid w:val="00FC693F"/>
     <w:pPr>
-      <w:spacing w:after="24" w:line="223" w:lineRule="auto"/>
+      <w:spacing w:after="36" w:line="245" w:lineRule="auto"/>
     </w:pPr>
     <w:rPr>
       <w:rFonts w:ascii="Arial" w:hAnsi="Arial" w:eastAsia="Arial"/>
-      <w:sz w:val="15"/>
+      <w:sz w:val="17"/>
     </w:rPr>
   </w:style>
   <w:style w:type="paragraph" w:styleId="Header">

</xml_diff>